<commit_message>
Update public resume exports
</commit_message>
<xml_diff>
--- a/resume/quentin-mcclellan-devops-platform-resume.docx
+++ b/resume/quentin-mcclellan-devops-platform-resume.docx
@@ -19,7 +19,7 @@
       <w:pPr>
         <w:pStyle w:val="BodyText"/>
         <w:bidi w:val="0"/>
-        <w:spacing w:before="15" w:after="45"/>
+        <w:spacing w:before="15" w:after="60"/>
         <w:ind w:left="15" w:right="15"/>
         <w:jc w:val="left"/>
         <w:rPr/>
@@ -35,42 +35,47 @@
       <w:pPr>
         <w:pStyle w:val="BodyText"/>
         <w:bidi w:val="0"/>
-        <w:spacing w:before="15" w:after="45"/>
+        <w:spacing w:before="15" w:after="60"/>
         <w:ind w:left="15" w:right="15"/>
         <w:jc w:val="left"/>
         <w:rPr/>
       </w:pPr>
       <w:r>
         <w:rPr/>
-        <w:t>Pennsylvania</w:t>
-      </w:r>
-    </w:p>
-    <w:p>
-      <w:pPr>
-        <w:pStyle w:val="BodyText"/>
-        <w:bidi w:val="0"/>
-        <w:spacing w:before="15" w:after="45"/>
+        <w:t>Pennsylvania | quentinmcclellan.com | contact@quentinmcclellan.com | github.com/qmcclellan | linkedin.com/in/quentinmmcclellan</w:t>
+      </w:r>
+    </w:p>
+    <w:p>
+      <w:pPr>
+        <w:pStyle w:val="Heading2"/>
+        <w:numPr>
+          <w:ilvl w:val="0"/>
+          <w:numId w:val="0"/>
+        </w:numPr>
+        <w:pBdr/>
+        <w:bidi w:val="0"/>
+        <w:spacing w:before="105" w:after="45"/>
+        <w:ind w:left="105" w:right="105"/>
+        <w:jc w:val="left"/>
+        <w:rPr/>
+      </w:pPr>
+      <w:r>
+        <w:rPr/>
+        <w:t>Summary</w:t>
+      </w:r>
+    </w:p>
+    <w:p>
+      <w:pPr>
+        <w:pStyle w:val="BodyText"/>
+        <w:bidi w:val="0"/>
+        <w:spacing w:before="15" w:after="60"/>
         <w:ind w:left="15" w:right="15"/>
         <w:jc w:val="left"/>
         <w:rPr/>
       </w:pPr>
       <w:r>
         <w:rPr/>
-        <w:t>quentinmcclellan.com | contact@quentinmcclellan.com | github.com/qmcclellan | linkedin.com/in/quentinmmcclellan</w:t>
-      </w:r>
-    </w:p>
-    <w:p>
-      <w:pPr>
-        <w:pStyle w:val="BodyText"/>
-        <w:bidi w:val="0"/>
-        <w:spacing w:before="15" w:after="45"/>
-        <w:ind w:left="15" w:right="15"/>
-        <w:jc w:val="left"/>
-        <w:rPr/>
-      </w:pPr>
-      <w:r>
-        <w:rPr/>
-        <w:t>---</w:t>
+        <w:t>Platform / DevOps systems builder with hands-on Linux, Docker Compose, workflow automation, and operations discipline. Creator of StarkGrid, a private MVP/demo-ready proof platform demonstrating governed ingestion, service checks, evidence capture, and source-backed validation.</w:t>
       </w:r>
     </w:p>
     <w:p>
@@ -82,41 +87,8 @@
         </w:numPr>
         <w:pBdr/>
         <w:bidi w:val="0"/>
-        <w:spacing w:before="75" w:after="30"/>
-        <w:ind w:left="75" w:right="75"/>
-        <w:jc w:val="left"/>
-        <w:rPr/>
-      </w:pPr>
-      <w:r>
-        <w:rPr/>
-        <w:t>Summary</w:t>
-      </w:r>
-    </w:p>
-    <w:p>
-      <w:pPr>
-        <w:pStyle w:val="BodyText"/>
-        <w:bidi w:val="0"/>
-        <w:spacing w:before="15" w:after="45"/>
-        <w:ind w:left="15" w:right="15"/>
-        <w:jc w:val="left"/>
-        <w:rPr/>
-      </w:pPr>
-      <w:r>
-        <w:rPr/>
-        <w:t>Practical platform and DevOps systems builder with hands-on Linux, Docker Compose, workflow automation, and operations discipline. Creator of StarkGrid, a private MVP/demo-ready governed ingestion and operational evidence platform used as source-backed proof of platform design, automation, observability, and runbook habits. Background combines technical lab infrastructure with real-world operations experience in logistics, fulfillment, inventory, handoffs, and reliability.</w:t>
-      </w:r>
-    </w:p>
-    <w:p>
-      <w:pPr>
-        <w:pStyle w:val="Heading2"/>
-        <w:numPr>
-          <w:ilvl w:val="0"/>
-          <w:numId w:val="0"/>
-        </w:numPr>
-        <w:pBdr/>
-        <w:bidi w:val="0"/>
-        <w:spacing w:before="75" w:after="30"/>
-        <w:ind w:left="75" w:right="75"/>
+        <w:spacing w:before="105" w:after="45"/>
+        <w:ind w:left="105" w:right="105"/>
         <w:jc w:val="left"/>
         <w:rPr/>
       </w:pPr>
@@ -178,7 +150,7 @@
       </w:r>
       <w:r>
         <w:rPr/>
-        <w:t xml:space="preserve"> Bash, Python, n8n, Git/GitHub/Gitea, Maven </w:t>
+        <w:t xml:space="preserve"> Bash, Python, Git/GitHub/Gitea, n8n, Maven </w:t>
       </w:r>
     </w:p>
     <w:p>
@@ -233,7 +205,7 @@
       </w:r>
       <w:r>
         <w:rPr/>
-        <w:t xml:space="preserve"> Java, Spring, Maven, JavaScript/TypeScript familiarity </w:t>
+        <w:t xml:space="preserve"> Java, Spring, JavaScript/TypeScript familiarity </w:t>
       </w:r>
     </w:p>
     <w:p>
@@ -245,8 +217,8 @@
         </w:numPr>
         <w:pBdr/>
         <w:bidi w:val="0"/>
-        <w:spacing w:before="75" w:after="30"/>
-        <w:ind w:left="75" w:right="75"/>
+        <w:spacing w:before="105" w:after="45"/>
+        <w:ind w:left="105" w:right="105"/>
         <w:jc w:val="left"/>
         <w:rPr/>
       </w:pPr>
@@ -259,7 +231,7 @@
       <w:pPr>
         <w:pStyle w:val="BodyText"/>
         <w:bidi w:val="0"/>
-        <w:spacing w:before="15" w:after="45"/>
+        <w:spacing w:before="15" w:after="60"/>
         <w:ind w:left="15" w:right="15"/>
         <w:jc w:val="left"/>
         <w:rPr/>
@@ -290,7 +262,7 @@
       </w:pPr>
       <w:r>
         <w:rPr/>
-        <w:t xml:space="preserve">Built StarkGrid as a private, demo-ready platform for deterministic ingestion, workflow governance, operational evidence, and infrastructure validation; no production customer claim. </w:t>
+        <w:t xml:space="preserve">Built a governed ingestion and operational evidence platform for deterministic workflow validation, service checks, runbooks, and public-safe proof; no production customer claim. </w:t>
       </w:r>
     </w:p>
     <w:p>
@@ -312,7 +284,7 @@
       </w:pPr>
       <w:r>
         <w:rPr/>
-        <w:t xml:space="preserve">Built a multi-node lab topology with Jarvis, Friday, Ultron, and shared evidence/storage concepts while keeping operational proof private and sanitized for public/career materials. </w:t>
+        <w:t xml:space="preserve">Validated proof path: Hecate policy gate → Friday n8n → Jarvis benchmark harness → Athena/Search evidence. </w:t>
       </w:r>
     </w:p>
     <w:p>
@@ -334,29 +306,7 @@
       </w:pPr>
       <w:r>
         <w:rPr/>
-        <w:t xml:space="preserve">Validated governed proof path: Hecate policy gate → Friday n8n → Jarvis benchmark harness → Athena/Search evidence. </w:t>
-      </w:r>
-    </w:p>
-    <w:p>
-      <w:pPr>
-        <w:pStyle w:val="BodyText"/>
-        <w:numPr>
-          <w:ilvl w:val="0"/>
-          <w:numId w:val="3"/>
-        </w:numPr>
-        <w:tabs>
-          <w:tab w:val="clear" w:pos="1134"/>
-          <w:tab w:val="left" w:pos="724" w:leader="none"/>
-        </w:tabs>
-        <w:bidi w:val="0"/>
-        <w:spacing w:before="15" w:after="0"/>
-        <w:ind w:hanging="283" w:left="724"/>
-        <w:jc w:val="left"/>
-        <w:rPr/>
-      </w:pPr>
-      <w:r>
-        <w:rPr/>
-        <w:t xml:space="preserve">Final Rocketbook proof run: </w:t>
+        <w:t xml:space="preserve">Final Rocketbook proof: </w:t>
       </w:r>
       <w:r>
         <w:rPr>
@@ -372,17 +322,7 @@
         <w:rPr>
           <w:rStyle w:val="SourceText"/>
         </w:rPr>
-        <w:t>sourceBacked</w:t>
-      </w:r>
-      <w:r>
-        <w:rPr/>
-        <w:t xml:space="preserve"> / </w:t>
-      </w:r>
-      <w:r>
-        <w:rPr>
-          <w:rStyle w:val="SourceText"/>
-        </w:rPr>
-        <w:t>documents</w:t>
+        <w:t>sourceBacked/documents</w:t>
       </w:r>
       <w:r>
         <w:rPr/>
@@ -411,7 +351,6 @@
           <w:tab w:val="left" w:pos="724" w:leader="none"/>
         </w:tabs>
         <w:bidi w:val="0"/>
-        <w:spacing w:before="15" w:after="0"/>
         <w:ind w:hanging="283" w:left="724"/>
         <w:jc w:val="left"/>
         <w:rPr/>
@@ -428,28 +367,7 @@
       </w:r>
       <w:r>
         <w:rPr/>
-        <w:t xml:space="preserve">. </w:t>
-      </w:r>
-    </w:p>
-    <w:p>
-      <w:pPr>
-        <w:pStyle w:val="BodyText"/>
-        <w:numPr>
-          <w:ilvl w:val="0"/>
-          <w:numId w:val="3"/>
-        </w:numPr>
-        <w:tabs>
-          <w:tab w:val="clear" w:pos="1134"/>
-          <w:tab w:val="left" w:pos="724" w:leader="none"/>
-        </w:tabs>
-        <w:bidi w:val="0"/>
-        <w:ind w:hanging="283" w:left="724"/>
-        <w:jc w:val="left"/>
-        <w:rPr/>
-      </w:pPr>
-      <w:r>
-        <w:rPr/>
-        <w:t xml:space="preserve">Caveat: GPU OCR and embeddings were intentionally not enabled; the proof shows governed distributed worker visibility and GPU-capable node discovery, not production GPU OCR acceleration. </w:t>
+        <w:t xml:space="preserve">; caveat: GPU OCR and embeddings were intentionally not enabled, so this is not a production GPU OCR acceleration claim. </w:t>
       </w:r>
     </w:p>
     <w:p>
@@ -461,31 +379,31 @@
         </w:numPr>
         <w:pBdr/>
         <w:bidi w:val="0"/>
-        <w:spacing w:before="75" w:after="30"/>
+        <w:spacing w:before="105" w:after="45"/>
+        <w:ind w:left="105" w:right="105"/>
+        <w:jc w:val="left"/>
+        <w:rPr/>
+      </w:pPr>
+      <w:r>
+        <w:rPr/>
+        <w:t>Professional Experience</w:t>
+      </w:r>
+    </w:p>
+    <w:p>
+      <w:pPr>
+        <w:pStyle w:val="Heading3"/>
+        <w:numPr>
+          <w:ilvl w:val="0"/>
+          <w:numId w:val="0"/>
+        </w:numPr>
+        <w:bidi w:val="0"/>
+        <w:spacing w:before="75" w:after="15"/>
         <w:ind w:left="75" w:right="75"/>
         <w:jc w:val="left"/>
         <w:rPr/>
       </w:pPr>
       <w:r>
         <w:rPr/>
-        <w:t>Professional Experience</w:t>
-      </w:r>
-    </w:p>
-    <w:p>
-      <w:pPr>
-        <w:pStyle w:val="Heading3"/>
-        <w:numPr>
-          <w:ilvl w:val="0"/>
-          <w:numId w:val="0"/>
-        </w:numPr>
-        <w:bidi w:val="0"/>
-        <w:spacing w:before="45" w:after="15"/>
-        <w:ind w:left="45" w:right="45"/>
-        <w:jc w:val="left"/>
-        <w:rPr/>
-      </w:pPr>
-      <w:r>
-        <w:rPr/>
         <w:t>Founder &amp; Consultant / Creator — StarkGrid</w:t>
       </w:r>
     </w:p>
@@ -493,7 +411,7 @@
       <w:pPr>
         <w:pStyle w:val="BodyText"/>
         <w:bidi w:val="0"/>
-        <w:spacing w:before="15" w:after="45"/>
+        <w:spacing w:before="15" w:after="60"/>
         <w:ind w:left="15" w:right="15"/>
         <w:jc w:val="left"/>
         <w:rPr/>
@@ -524,7 +442,7 @@
       </w:pPr>
       <w:r>
         <w:rPr/>
-        <w:t xml:space="preserve">Created a governed ingestion and evidence platform using Linux hosts, Docker Compose services, Java/Spring/Maven components, Python automation, Redpanda/Kafka checks, n8n workflows, Athena observability, and search evidence. </w:t>
+        <w:t xml:space="preserve">Built and operated a private Linux/Docker Compose lab with Java/Spring/Maven services, Python/Bash automation, Redpanda/Kafka checks, n8n workflows, Athena observability, and source-backed search evidence. </w:t>
       </w:r>
     </w:p>
     <w:p>
@@ -545,7 +463,7 @@
       </w:pPr>
       <w:r>
         <w:rPr/>
-        <w:t xml:space="preserve">Wrote runbooks, validation checks, caveats, and source-backed career proof so reviewers can evaluate the system without relying on unsupported claims. </w:t>
+        <w:t xml:space="preserve">Produced runbooks, validation checks, caveats, and sanitized proof so reviewers can evaluate system behavior without unsupported claims. </w:t>
       </w:r>
     </w:p>
     <w:p>
@@ -556,8 +474,8 @@
           <w:numId w:val="0"/>
         </w:numPr>
         <w:bidi w:val="0"/>
-        <w:spacing w:before="45" w:after="15"/>
-        <w:ind w:left="45" w:right="45"/>
+        <w:spacing w:before="75" w:after="15"/>
+        <w:ind w:left="75" w:right="75"/>
         <w:jc w:val="left"/>
         <w:rPr/>
       </w:pPr>
@@ -570,7 +488,7 @@
       <w:pPr>
         <w:pStyle w:val="BodyText"/>
         <w:bidi w:val="0"/>
-        <w:spacing w:before="15" w:after="45"/>
+        <w:spacing w:before="15" w:after="60"/>
         <w:ind w:left="15" w:right="15"/>
         <w:jc w:val="left"/>
         <w:rPr/>
@@ -594,35 +512,13 @@
           <w:tab w:val="left" w:pos="724" w:leader="none"/>
         </w:tabs>
         <w:bidi w:val="0"/>
-        <w:spacing w:before="15" w:after="0"/>
         <w:ind w:hanging="283" w:left="724"/>
         <w:jc w:val="left"/>
         <w:rPr/>
       </w:pPr>
       <w:r>
         <w:rPr/>
-        <w:t xml:space="preserve">Built logistics and operations habits around shift reliability, status accuracy, repeatable routines, handoffs, and visible execution. </w:t>
-      </w:r>
-    </w:p>
-    <w:p>
-      <w:pPr>
-        <w:pStyle w:val="BodyText"/>
-        <w:numPr>
-          <w:ilvl w:val="0"/>
-          <w:numId w:val="5"/>
-        </w:numPr>
-        <w:tabs>
-          <w:tab w:val="clear" w:pos="1134"/>
-          <w:tab w:val="left" w:pos="724" w:leader="none"/>
-        </w:tabs>
-        <w:bidi w:val="0"/>
-        <w:ind w:hanging="283" w:left="724"/>
-        <w:jc w:val="left"/>
-        <w:rPr/>
-      </w:pPr>
-      <w:r>
-        <w:rPr/>
-        <w:t xml:space="preserve">Applied operator discipline to platform work: clear service state, checklists, runbooks, and practical troubleshooting. </w:t>
+        <w:t xml:space="preserve">Supported reliable logistics execution through accurate status handling, repeatable handoffs, process discipline, and practical troubleshooting under time-sensitive operating conditions. </w:t>
       </w:r>
     </w:p>
     <w:p>
@@ -633,8 +529,8 @@
           <w:numId w:val="0"/>
         </w:numPr>
         <w:bidi w:val="0"/>
-        <w:spacing w:before="45" w:after="15"/>
-        <w:ind w:left="45" w:right="45"/>
+        <w:spacing w:before="75" w:after="15"/>
+        <w:ind w:left="75" w:right="75"/>
         <w:jc w:val="left"/>
         <w:rPr/>
       </w:pPr>
@@ -647,7 +543,7 @@
       <w:pPr>
         <w:pStyle w:val="BodyText"/>
         <w:bidi w:val="0"/>
-        <w:spacing w:before="15" w:after="45"/>
+        <w:spacing w:before="15" w:after="60"/>
         <w:ind w:left="15" w:right="15"/>
         <w:jc w:val="left"/>
         <w:rPr/>
@@ -671,35 +567,13 @@
           <w:tab w:val="left" w:pos="724" w:leader="none"/>
         </w:tabs>
         <w:bidi w:val="0"/>
-        <w:spacing w:before="15" w:after="0"/>
         <w:ind w:hanging="283" w:left="724"/>
         <w:jc w:val="left"/>
         <w:rPr/>
       </w:pPr>
       <w:r>
         <w:rPr/>
-        <w:t xml:space="preserve">Managed cross-store retail food operations with inventory/shrink awareness, workflow discipline, quality expectations, vendor coordination, and team handoffs. </w:t>
-      </w:r>
-    </w:p>
-    <w:p>
-      <w:pPr>
-        <w:pStyle w:val="BodyText"/>
-        <w:numPr>
-          <w:ilvl w:val="0"/>
-          <w:numId w:val="6"/>
-        </w:numPr>
-        <w:tabs>
-          <w:tab w:val="clear" w:pos="1134"/>
-          <w:tab w:val="left" w:pos="724" w:leader="none"/>
-        </w:tabs>
-        <w:bidi w:val="0"/>
-        <w:ind w:hanging="283" w:left="724"/>
-        <w:jc w:val="left"/>
-        <w:rPr/>
-      </w:pPr>
-      <w:r>
-        <w:rPr/>
-        <w:t xml:space="preserve">Improved practical process judgment in time-sensitive, customer-facing environments where reliability and execution mattered. </w:t>
+        <w:t xml:space="preserve">Coordinated cross-store execution with inventory/shrink awareness, vendor and team handoffs, quality standards, and process improvements in customer-facing operations. </w:t>
       </w:r>
     </w:p>
     <w:p>
@@ -710,193 +584,71 @@
           <w:numId w:val="0"/>
         </w:numPr>
         <w:bidi w:val="0"/>
-        <w:spacing w:before="45" w:after="15"/>
-        <w:ind w:left="45" w:right="45"/>
-        <w:jc w:val="left"/>
-        <w:rPr/>
-      </w:pPr>
-      <w:r>
-        <w:rPr/>
-        <w:t>Fulfillment — Azar Displays</w:t>
-      </w:r>
-    </w:p>
-    <w:p>
-      <w:pPr>
-        <w:pStyle w:val="BodyText"/>
-        <w:bidi w:val="0"/>
-        <w:spacing w:before="15" w:after="45"/>
+        <w:spacing w:before="75" w:after="15"/>
+        <w:ind w:left="75" w:right="75"/>
+        <w:jc w:val="left"/>
+        <w:rPr/>
+      </w:pPr>
+      <w:r>
+        <w:rPr/>
+        <w:t>Additional Operations Experience</w:t>
+      </w:r>
+    </w:p>
+    <w:p>
+      <w:pPr>
+        <w:pStyle w:val="BodyText"/>
+        <w:bidi w:val="0"/>
+        <w:spacing w:before="15" w:after="60"/>
         <w:ind w:left="15" w:right="15"/>
         <w:jc w:val="left"/>
         <w:rPr/>
       </w:pPr>
       <w:r>
-        <w:rPr>
-          <w:rStyle w:val="Strong"/>
-        </w:rPr>
-        <w:t>Jul 2021 – Sep 2021</w:t>
-      </w:r>
-    </w:p>
-    <w:p>
-      <w:pPr>
-        <w:pStyle w:val="BodyText"/>
-        <w:numPr>
-          <w:ilvl w:val="0"/>
-          <w:numId w:val="7"/>
-        </w:numPr>
-        <w:tabs>
-          <w:tab w:val="clear" w:pos="1134"/>
-          <w:tab w:val="left" w:pos="724" w:leader="none"/>
-        </w:tabs>
-        <w:bidi w:val="0"/>
-        <w:ind w:hanging="283" w:left="724"/>
-        <w:jc w:val="left"/>
-        <w:rPr/>
-      </w:pPr>
-      <w:r>
-        <w:rPr/>
-        <w:t xml:space="preserve">Supported fulfillment and shipping operations with attention to order accuracy, packaging flow, throughput, and handoff quality. </w:t>
-      </w:r>
-    </w:p>
-    <w:p>
-      <w:pPr>
-        <w:pStyle w:val="Heading3"/>
+        <w:rPr/>
+        <w:t>Azar Displays — Fulfillment, Jul 2021 – Sep 2021; White Haven Market — Butcher, Sep 2019 – Jul 2020.</w:t>
+      </w:r>
+    </w:p>
+    <w:p>
+      <w:pPr>
+        <w:pStyle w:val="Heading2"/>
         <w:numPr>
           <w:ilvl w:val="0"/>
           <w:numId w:val="0"/>
         </w:numPr>
-        <w:bidi w:val="0"/>
-        <w:spacing w:before="45" w:after="15"/>
-        <w:ind w:left="45" w:right="45"/>
-        <w:jc w:val="left"/>
-        <w:rPr/>
-      </w:pPr>
-      <w:r>
-        <w:rPr/>
-        <w:t>Butcher — White Haven Market</w:t>
-      </w:r>
-    </w:p>
-    <w:p>
-      <w:pPr>
-        <w:pStyle w:val="BodyText"/>
-        <w:bidi w:val="0"/>
-        <w:spacing w:before="15" w:after="45"/>
+        <w:pBdr/>
+        <w:bidi w:val="0"/>
+        <w:spacing w:before="105" w:after="45"/>
+        <w:ind w:left="105" w:right="105"/>
+        <w:jc w:val="left"/>
+        <w:rPr/>
+      </w:pPr>
+      <w:r>
+        <w:rPr/>
+        <w:t>Education</w:t>
+      </w:r>
+    </w:p>
+    <w:p>
+      <w:pPr>
+        <w:pStyle w:val="BodyText"/>
+        <w:bidi w:val="0"/>
+        <w:spacing w:before="15" w:after="60"/>
         <w:ind w:left="15" w:right="15"/>
         <w:jc w:val="left"/>
         <w:rPr/>
       </w:pPr>
       <w:r>
-        <w:rPr>
-          <w:rStyle w:val="Strong"/>
-        </w:rPr>
-        <w:t>Sep 2019 – Jul 2020</w:t>
-      </w:r>
-    </w:p>
-    <w:p>
-      <w:pPr>
-        <w:pStyle w:val="BodyText"/>
-        <w:numPr>
-          <w:ilvl w:val="0"/>
-          <w:numId w:val="8"/>
-        </w:numPr>
-        <w:tabs>
-          <w:tab w:val="clear" w:pos="1134"/>
-          <w:tab w:val="left" w:pos="724" w:leader="none"/>
-        </w:tabs>
-        <w:bidi w:val="0"/>
-        <w:ind w:hanging="283" w:left="724"/>
-        <w:jc w:val="left"/>
-        <w:rPr/>
-      </w:pPr>
-      <w:r>
-        <w:rPr/>
-        <w:t xml:space="preserve">Supported daily retail meat operations through product preparation, quality awareness, customer service, and dependable execution. </w:t>
-      </w:r>
-    </w:p>
-    <w:p>
-      <w:pPr>
-        <w:pStyle w:val="Heading2"/>
-        <w:numPr>
-          <w:ilvl w:val="0"/>
-          <w:numId w:val="0"/>
-        </w:numPr>
-        <w:pBdr/>
-        <w:bidi w:val="0"/>
-        <w:spacing w:before="75" w:after="30"/>
-        <w:ind w:left="75" w:right="75"/>
-        <w:jc w:val="left"/>
-        <w:rPr/>
-      </w:pPr>
-      <w:r>
-        <w:rPr/>
-        <w:t>Education</w:t>
-      </w:r>
-    </w:p>
-    <w:p>
-      <w:pPr>
-        <w:pStyle w:val="BodyText"/>
-        <w:bidi w:val="0"/>
-        <w:spacing w:before="15" w:after="45"/>
-        <w:ind w:left="15" w:right="15"/>
-        <w:jc w:val="left"/>
-        <w:rPr/>
-      </w:pPr>
-      <w:r>
-        <w:rPr>
-          <w:rStyle w:val="Strong"/>
-        </w:rPr>
-        <w:t>Colorado Technical University</w:t>
-      </w:r>
-    </w:p>
-    <w:p>
-      <w:pPr>
-        <w:pStyle w:val="BodyText"/>
-        <w:bidi w:val="0"/>
-        <w:spacing w:before="15" w:after="45"/>
-        <w:ind w:left="15" w:right="15"/>
-        <w:jc w:val="left"/>
-        <w:rPr/>
-      </w:pPr>
-      <w:r>
-        <w:rPr/>
-        <w:t>Bachelor of Science — IT Software Engineering</w:t>
-      </w:r>
-    </w:p>
-    <w:p>
-      <w:pPr>
-        <w:pStyle w:val="BodyText"/>
-        <w:bidi w:val="0"/>
-        <w:spacing w:before="15" w:after="45"/>
-        <w:ind w:left="15" w:right="15"/>
-        <w:jc w:val="left"/>
-        <w:rPr/>
-      </w:pPr>
-      <w:r>
-        <w:rPr/>
-        <w:t>2016 – 2019</w:t>
-      </w:r>
-    </w:p>
-    <w:p>
-      <w:pPr>
-        <w:pStyle w:val="BodyText"/>
-        <w:bidi w:val="0"/>
-        <w:spacing w:before="15" w:after="45"/>
-        <w:ind w:left="15" w:right="15"/>
-        <w:jc w:val="left"/>
-        <w:rPr/>
-      </w:pPr>
-      <w:r>
-        <w:rPr/>
-        <w:t>GPA/Grade: 3.59</w:t>
+        <w:rPr/>
+        <w:t>Colorado Technical University — Bachelor of Science, IT Software Engineering, 2016–2019; GPA: 3.59</w:t>
       </w:r>
     </w:p>
     <w:sectPr>
       <w:type w:val="nextPage"/>
       <w:pgSz w:w="12240" w:h="15840"/>
-      <w:pgMar w:left="547" w:right="547" w:gutter="0" w:header="0" w:top="432" w:footer="0" w:bottom="432"/>
+      <w:pgMar w:left="691" w:right="691" w:gutter="0" w:header="0" w:top="605" w:footer="0" w:bottom="547"/>
       <w:pgNumType w:fmt="decimal"/>
       <w:formProt w:val="false"/>
       <w:textDirection w:val="lrTb"/>
-      <w:docGrid w:type="default" w:linePitch="600" w:charSpace="48332"/>
+      <w:docGrid w:type="default" w:linePitch="600" w:charSpace="45056"/>
     </w:sectPr>
   </w:body>
 </w:document>
@@ -1572,280 +1324,6 @@
     </w:lvl>
   </w:abstractNum>
   <w:abstractNum w:abstractNumId="6">
-    <w:lvl w:ilvl="0">
-      <w:start w:val="1"/>
-      <w:numFmt w:val="bullet"/>
-      <w:lvlText w:val=""/>
-      <w:lvlJc w:val="left"/>
-      <w:pPr>
-        <w:tabs>
-          <w:tab w:val="num" w:pos="709"/>
-        </w:tabs>
-        <w:ind w:left="709" w:hanging="283"/>
-      </w:pPr>
-      <w:rPr>
-        <w:rFonts w:ascii="Symbol" w:hAnsi="Symbol" w:cs="Symbol" w:hint="default"/>
-      </w:rPr>
-    </w:lvl>
-    <w:lvl w:ilvl="1">
-      <w:start w:val="1"/>
-      <w:numFmt w:val="bullet"/>
-      <w:lvlText w:val=""/>
-      <w:lvlJc w:val="left"/>
-      <w:pPr>
-        <w:tabs>
-          <w:tab w:val="num" w:pos="1418"/>
-        </w:tabs>
-        <w:ind w:left="1418" w:hanging="283"/>
-      </w:pPr>
-      <w:rPr>
-        <w:rFonts w:ascii="Symbol" w:hAnsi="Symbol" w:cs="Symbol" w:hint="default"/>
-      </w:rPr>
-    </w:lvl>
-    <w:lvl w:ilvl="2">
-      <w:start w:val="1"/>
-      <w:numFmt w:val="bullet"/>
-      <w:lvlText w:val=""/>
-      <w:lvlJc w:val="left"/>
-      <w:pPr>
-        <w:tabs>
-          <w:tab w:val="num" w:pos="2127"/>
-        </w:tabs>
-        <w:ind w:left="2127" w:hanging="283"/>
-      </w:pPr>
-      <w:rPr>
-        <w:rFonts w:ascii="Symbol" w:hAnsi="Symbol" w:cs="Symbol" w:hint="default"/>
-      </w:rPr>
-    </w:lvl>
-    <w:lvl w:ilvl="3">
-      <w:start w:val="1"/>
-      <w:numFmt w:val="bullet"/>
-      <w:lvlText w:val=""/>
-      <w:lvlJc w:val="left"/>
-      <w:pPr>
-        <w:tabs>
-          <w:tab w:val="num" w:pos="2836"/>
-        </w:tabs>
-        <w:ind w:left="2836" w:hanging="283"/>
-      </w:pPr>
-      <w:rPr>
-        <w:rFonts w:ascii="Symbol" w:hAnsi="Symbol" w:cs="Symbol" w:hint="default"/>
-      </w:rPr>
-    </w:lvl>
-    <w:lvl w:ilvl="4">
-      <w:start w:val="1"/>
-      <w:numFmt w:val="bullet"/>
-      <w:lvlText w:val=""/>
-      <w:lvlJc w:val="left"/>
-      <w:pPr>
-        <w:tabs>
-          <w:tab w:val="num" w:pos="3545"/>
-        </w:tabs>
-        <w:ind w:left="3545" w:hanging="283"/>
-      </w:pPr>
-      <w:rPr>
-        <w:rFonts w:ascii="Symbol" w:hAnsi="Symbol" w:cs="Symbol" w:hint="default"/>
-      </w:rPr>
-    </w:lvl>
-    <w:lvl w:ilvl="5">
-      <w:start w:val="1"/>
-      <w:numFmt w:val="bullet"/>
-      <w:lvlText w:val=""/>
-      <w:lvlJc w:val="left"/>
-      <w:pPr>
-        <w:tabs>
-          <w:tab w:val="num" w:pos="4254"/>
-        </w:tabs>
-        <w:ind w:left="4254" w:hanging="283"/>
-      </w:pPr>
-      <w:rPr>
-        <w:rFonts w:ascii="Symbol" w:hAnsi="Symbol" w:cs="Symbol" w:hint="default"/>
-      </w:rPr>
-    </w:lvl>
-    <w:lvl w:ilvl="6">
-      <w:start w:val="1"/>
-      <w:numFmt w:val="bullet"/>
-      <w:lvlText w:val=""/>
-      <w:lvlJc w:val="left"/>
-      <w:pPr>
-        <w:tabs>
-          <w:tab w:val="num" w:pos="4963"/>
-        </w:tabs>
-        <w:ind w:left="4963" w:hanging="283"/>
-      </w:pPr>
-      <w:rPr>
-        <w:rFonts w:ascii="Symbol" w:hAnsi="Symbol" w:cs="Symbol" w:hint="default"/>
-      </w:rPr>
-    </w:lvl>
-    <w:lvl w:ilvl="7">
-      <w:start w:val="1"/>
-      <w:numFmt w:val="bullet"/>
-      <w:lvlText w:val=""/>
-      <w:lvlJc w:val="left"/>
-      <w:pPr>
-        <w:tabs>
-          <w:tab w:val="num" w:pos="5672"/>
-        </w:tabs>
-        <w:ind w:left="5672" w:hanging="283"/>
-      </w:pPr>
-      <w:rPr>
-        <w:rFonts w:ascii="Symbol" w:hAnsi="Symbol" w:cs="Symbol" w:hint="default"/>
-      </w:rPr>
-    </w:lvl>
-    <w:lvl w:ilvl="8">
-      <w:start w:val="1"/>
-      <w:numFmt w:val="bullet"/>
-      <w:lvlText w:val=""/>
-      <w:lvlJc w:val="left"/>
-      <w:pPr>
-        <w:tabs>
-          <w:tab w:val="num" w:pos="6381"/>
-        </w:tabs>
-        <w:ind w:left="6381" w:hanging="283"/>
-      </w:pPr>
-      <w:rPr>
-        <w:rFonts w:ascii="Symbol" w:hAnsi="Symbol" w:cs="Symbol" w:hint="default"/>
-      </w:rPr>
-    </w:lvl>
-  </w:abstractNum>
-  <w:abstractNum w:abstractNumId="7">
-    <w:lvl w:ilvl="0">
-      <w:start w:val="1"/>
-      <w:numFmt w:val="bullet"/>
-      <w:lvlText w:val=""/>
-      <w:lvlJc w:val="left"/>
-      <w:pPr>
-        <w:tabs>
-          <w:tab w:val="num" w:pos="709"/>
-        </w:tabs>
-        <w:ind w:left="709" w:hanging="283"/>
-      </w:pPr>
-      <w:rPr>
-        <w:rFonts w:ascii="Symbol" w:hAnsi="Symbol" w:cs="Symbol" w:hint="default"/>
-      </w:rPr>
-    </w:lvl>
-    <w:lvl w:ilvl="1">
-      <w:start w:val="1"/>
-      <w:numFmt w:val="bullet"/>
-      <w:lvlText w:val=""/>
-      <w:lvlJc w:val="left"/>
-      <w:pPr>
-        <w:tabs>
-          <w:tab w:val="num" w:pos="1418"/>
-        </w:tabs>
-        <w:ind w:left="1418" w:hanging="283"/>
-      </w:pPr>
-      <w:rPr>
-        <w:rFonts w:ascii="Symbol" w:hAnsi="Symbol" w:cs="Symbol" w:hint="default"/>
-      </w:rPr>
-    </w:lvl>
-    <w:lvl w:ilvl="2">
-      <w:start w:val="1"/>
-      <w:numFmt w:val="bullet"/>
-      <w:lvlText w:val=""/>
-      <w:lvlJc w:val="left"/>
-      <w:pPr>
-        <w:tabs>
-          <w:tab w:val="num" w:pos="2127"/>
-        </w:tabs>
-        <w:ind w:left="2127" w:hanging="283"/>
-      </w:pPr>
-      <w:rPr>
-        <w:rFonts w:ascii="Symbol" w:hAnsi="Symbol" w:cs="Symbol" w:hint="default"/>
-      </w:rPr>
-    </w:lvl>
-    <w:lvl w:ilvl="3">
-      <w:start w:val="1"/>
-      <w:numFmt w:val="bullet"/>
-      <w:lvlText w:val=""/>
-      <w:lvlJc w:val="left"/>
-      <w:pPr>
-        <w:tabs>
-          <w:tab w:val="num" w:pos="2836"/>
-        </w:tabs>
-        <w:ind w:left="2836" w:hanging="283"/>
-      </w:pPr>
-      <w:rPr>
-        <w:rFonts w:ascii="Symbol" w:hAnsi="Symbol" w:cs="Symbol" w:hint="default"/>
-      </w:rPr>
-    </w:lvl>
-    <w:lvl w:ilvl="4">
-      <w:start w:val="1"/>
-      <w:numFmt w:val="bullet"/>
-      <w:lvlText w:val=""/>
-      <w:lvlJc w:val="left"/>
-      <w:pPr>
-        <w:tabs>
-          <w:tab w:val="num" w:pos="3545"/>
-        </w:tabs>
-        <w:ind w:left="3545" w:hanging="283"/>
-      </w:pPr>
-      <w:rPr>
-        <w:rFonts w:ascii="Symbol" w:hAnsi="Symbol" w:cs="Symbol" w:hint="default"/>
-      </w:rPr>
-    </w:lvl>
-    <w:lvl w:ilvl="5">
-      <w:start w:val="1"/>
-      <w:numFmt w:val="bullet"/>
-      <w:lvlText w:val=""/>
-      <w:lvlJc w:val="left"/>
-      <w:pPr>
-        <w:tabs>
-          <w:tab w:val="num" w:pos="4254"/>
-        </w:tabs>
-        <w:ind w:left="4254" w:hanging="283"/>
-      </w:pPr>
-      <w:rPr>
-        <w:rFonts w:ascii="Symbol" w:hAnsi="Symbol" w:cs="Symbol" w:hint="default"/>
-      </w:rPr>
-    </w:lvl>
-    <w:lvl w:ilvl="6">
-      <w:start w:val="1"/>
-      <w:numFmt w:val="bullet"/>
-      <w:lvlText w:val=""/>
-      <w:lvlJc w:val="left"/>
-      <w:pPr>
-        <w:tabs>
-          <w:tab w:val="num" w:pos="4963"/>
-        </w:tabs>
-        <w:ind w:left="4963" w:hanging="283"/>
-      </w:pPr>
-      <w:rPr>
-        <w:rFonts w:ascii="Symbol" w:hAnsi="Symbol" w:cs="Symbol" w:hint="default"/>
-      </w:rPr>
-    </w:lvl>
-    <w:lvl w:ilvl="7">
-      <w:start w:val="1"/>
-      <w:numFmt w:val="bullet"/>
-      <w:lvlText w:val=""/>
-      <w:lvlJc w:val="left"/>
-      <w:pPr>
-        <w:tabs>
-          <w:tab w:val="num" w:pos="5672"/>
-        </w:tabs>
-        <w:ind w:left="5672" w:hanging="283"/>
-      </w:pPr>
-      <w:rPr>
-        <w:rFonts w:ascii="Symbol" w:hAnsi="Symbol" w:cs="Symbol" w:hint="default"/>
-      </w:rPr>
-    </w:lvl>
-    <w:lvl w:ilvl="8">
-      <w:start w:val="1"/>
-      <w:numFmt w:val="bullet"/>
-      <w:lvlText w:val=""/>
-      <w:lvlJc w:val="left"/>
-      <w:pPr>
-        <w:tabs>
-          <w:tab w:val="num" w:pos="6381"/>
-        </w:tabs>
-        <w:ind w:left="6381" w:hanging="283"/>
-      </w:pPr>
-      <w:rPr>
-        <w:rFonts w:ascii="Symbol" w:hAnsi="Symbol" w:cs="Symbol" w:hint="default"/>
-      </w:rPr>
-    </w:lvl>
-  </w:abstractNum>
-  <w:abstractNum w:abstractNumId="8">
     <w:lvl w:ilvl="0">
       <w:start w:val="1"/>
       <w:numFmt w:val="bullet"/>
@@ -2000,12 +1478,6 @@
   <w:num w:numId="6">
     <w:abstractNumId w:val="6"/>
   </w:num>
-  <w:num w:numId="7">
-    <w:abstractNumId w:val="7"/>
-  </w:num>
-  <w:num w:numId="8">
-    <w:abstractNumId w:val="8"/>
-  </w:num>
 </w:numbering>
 </file>
 
@@ -2035,13 +1507,13 @@
       <w:overflowPunct w:val="true"/>
       <w:autoSpaceDE w:val="true"/>
       <w:bidi w:val="0"/>
-      <w:spacing w:lineRule="auto" w:line="259"/>
+      <w:spacing w:lineRule="auto" w:line="276"/>
     </w:pPr>
     <w:rPr>
       <w:rFonts w:ascii="Arial;Helvetica;sans-serif" w:hAnsi="Arial;Helvetica;sans-serif" w:eastAsia="Arial;Helvetica;sans-serif" w:cs="Arial;Helvetica;sans-serif"/>
       <w:color w:val="111827"/>
-      <w:sz w:val="16"/>
-      <w:szCs w:val="16"/>
+      <w:sz w:val="18"/>
+      <w:szCs w:val="18"/>
       <w:lang w:val="en-US" w:eastAsia="zh-CN" w:bidi="hi-IN"/>
     </w:rPr>
   </w:style>
@@ -2058,8 +1530,8 @@
       <w:b/>
       <w:bCs/>
       <w:spacing w:val="0"/>
-      <w:sz w:val="34"/>
-      <w:szCs w:val="34"/>
+      <w:sz w:val="40"/>
+      <w:szCs w:val="40"/>
     </w:rPr>
   </w:style>
   <w:style w:type="paragraph" w:styleId="Heading2">
@@ -2075,8 +1547,8 @@
       <w:pBdr>
         <w:bottom w:val="single" w:sz="2" w:space="1" w:color="CBD5E1"/>
       </w:pBdr>
-      <w:spacing w:before="75" w:after="30"/>
-      <w:ind w:left="75" w:right="75"/>
+      <w:spacing w:before="105" w:after="45"/>
+      <w:ind w:left="105" w:right="105"/>
       <w:outlineLvl w:val="1"/>
     </w:pPr>
     <w:rPr>
@@ -2085,8 +1557,8 @@
       <w:bCs/>
       <w:caps/>
       <w:spacing w:val="0"/>
-      <w:sz w:val="19"/>
-      <w:szCs w:val="19"/>
+      <w:sz w:val="20"/>
+      <w:szCs w:val="20"/>
     </w:rPr>
   </w:style>
   <w:style w:type="paragraph" w:styleId="Heading3">
@@ -2099,16 +1571,16 @@
         <w:ilvl w:val="0"/>
         <w:numId w:val="0"/>
       </w:numPr>
-      <w:spacing w:before="45" w:after="15"/>
-      <w:ind w:left="45" w:right="45"/>
+      <w:spacing w:before="75" w:after="15"/>
+      <w:ind w:left="75" w:right="75"/>
       <w:outlineLvl w:val="2"/>
     </w:pPr>
     <w:rPr>
       <w:rFonts w:ascii="Liberation Serif" w:hAnsi="Liberation Serif" w:eastAsia="Noto Sans" w:cs="FreeSans"/>
       <w:b/>
       <w:bCs/>
-      <w:sz w:val="17"/>
-      <w:szCs w:val="17"/>
+      <w:sz w:val="18"/>
+      <w:szCs w:val="18"/>
     </w:rPr>
   </w:style>
   <w:style w:type="character" w:styleId="EndnoteCharacters">
@@ -2170,7 +1642,7 @@
     <w:name w:val="Body Text"/>
     <w:basedOn w:val="Normal"/>
     <w:pPr>
-      <w:spacing w:before="15" w:after="45"/>
+      <w:spacing w:before="15" w:after="60"/>
       <w:ind w:left="15" w:right="15"/>
     </w:pPr>
     <w:rPr/>

</xml_diff>